<commit_message>
docs: update Project-Design with Stripe and Leaflet.js bonus features
</commit_message>
<xml_diff>
--- a/Projects/VehicleRental/Project-Design.docx
+++ b/Projects/VehicleRental/Project-Design.docx
@@ -187,7 +187,35 @@
           <w:b w:val="0"/>
           <w:sz w:val="22"/>
         </w:rPr>
+        <w:t xml:space="preserve">Add interactive pickup location map using Leaflet.js + OpenStreetMap for reservation creation (bonus feature)</w:t>
+      </w:r>
+    </w:p>
+    <w:p>
+      <w:pPr>
+        <w:pStyle w:val="ListBullet"/>
+        <w:ind w:left="360"/>
+      </w:pPr>
+      <w:r>
+        <w:rPr>
+          <w:rFonts w:ascii="Calibri" w:hAnsi="Calibri"/>
+          <w:b w:val="0"/>
+          <w:sz w:val="22"/>
+        </w:rPr>
         <w:t>Develop Billing module (auto-calculate rental cost, tax, additional charges, mark paid)</w:t>
+      </w:r>
+    </w:p>
+    <w:p>
+      <w:pPr>
+        <w:pStyle w:val="ListBullet"/>
+        <w:ind w:left="360"/>
+      </w:pPr>
+      <w:r>
+        <w:rPr>
+          <w:rFonts w:ascii="Calibri" w:hAnsi="Calibri"/>
+          <w:b w:val="0"/>
+          <w:sz w:val="22"/>
+        </w:rPr>
+        <w:t xml:space="preserve">Integrate Stripe Checkout payment gateway for secure online billing (bonus feature)</w:t>
       </w:r>
     </w:p>
     <w:p>
@@ -433,7 +461,7 @@
           <w:b w:val="0"/>
           <w:sz w:val="22"/>
         </w:rPr>
-        <w:t>Wireframes were created in draw.io. The design covers 8 pages: Login, Register, Dashboard, Vehicles, Customers, Reservations, Billing, and Reports.</w:t>
+        <w:t>Wireframes were created in draw.io. The design covers 8 pages: Login, Register, Dashboard, Vehicles, Customers, Reservations, Billing, and Reports. The wireframes have been updated to include the interactive Leaflet.js pickup location map on the Create Reservation page, and the Stripe Checkout payment button on the Billing Details page.</w:t>
       </w:r>
     </w:p>
     <w:p/>

</xml_diff>